<commit_message>
Datum nespolehlivosti RSA-2048 přisoudit knihovně DSS, ne ETSI
Datum 1. 1. 2027 u klíčů RSA 1 900–2 999 bitů ETSI TS 119 312 míní pro
vydávání nových certifikátů TSA, ne pro spolehlivost už vydaných razítek.
Výchozí politika DSS 6.5 je ale uplatňuje i na dříve vydané razítko, jehož
užití nedoloží pozdější razítko (po aktualizaci sady 1. 2. 2026 jako
varování). Upozornění u zdroje, rada „Nejlépe ihned“ na kartě Analýzy
a záznam o zásahu proto zůstávají, jen datum přisuzují knihovně DSS.
Totéž v dokumentech; wordové podoby přegenerovány.

Co-Authored-By: Claude Opus 5.5 <noreply@anthropic.com>
</commit_message>
<xml_diff>
--- a/docs/AnEP-schopnosti-s-obrazky.docx
+++ b/docs/AnEP-schopnosti-s-obrazky.docx
@@ -6623,7 +6623,7 @@
     </w:p>
     <w:p>
       <w:r>
-        <w:t>Druhý důvod pro „Nejlépe ihned“: nejnovější časové razítko prvku je podepsané algoritmem, který podle ETSI TS 119 312 přestane být spolehlivý dřív, než lhůta uplyne — dnes typicky klíč RSA o 2 048 bitech s datem 1. 1. 2027. Aplikace AnEP na to datum reaguje jen varováním, jiné validátory ale takové razítko mohou odmítnout; nové razítko se silnějším algoritmem je proto třeba přidat dřív. Podepisuje-li slabým klíčem i vybraný zdroj razítek, upozorní na to blok „Jak dlouho je možné zachovat ověřitelnost?“.</w:t>
+        <w:t>Druhý důvod pro „Nejlépe ihned“: nejnovější časové razítko prvku je podepsané algoritmem, který podle knihovny DSS, nad kterou AnEP ověřuje, přestane být spolehlivý dřív, než lhůta uplyne — dnes typicky klíč RSA o 2 048 bitech s datem 1. 1. 2027. Aplikace AnEP na to datum reaguje jen varováním, jiné validátory ale takové razítko mohou odmítnout; nové razítko se silnějším algoritmem je proto třeba přidat dřív. Podepisuje-li slabým klíčem i vybraný zdroj razítek, upozorní na to blok „Jak dlouho je možné zachovat ověřitelnost?“.</w:t>
       </w:r>
     </w:p>
     <w:p>
@@ -7440,7 +7440,7 @@
         <w:t>algoritmus a délka klíče</w:t>
       </w:r>
       <w:r>
-        <w:t>, kterým autorita razítka podepisuje; přestane-li klíč být podle ETSI TS 119 312 spolehlivý dřív, než skončí certifikát autority — dnes typicky RSA o 2 048 bitech s datem 1. 1. 2027 —, správa zdrojů na to upozorní a doporučí zdroj s delším klíčem.</w:t>
+        <w:t>, kterým autorita razítka podepisuje; přestane-li klíč být podle knihovny DSS spolehlivý dřív, než skončí certifikát autority — dnes typicky RSA o 2 048 bitech s datem 1. 1. 2027 —, správa zdrojů na to upozorní a doporučí zdroj s delším klíčem.</w:t>
       </w:r>
     </w:p>
     <w:tbl>

</xml_diff>